<commit_message>
Update to assignment 1_3
</commit_message>
<xml_diff>
--- a/module-1/Sengvanhpheng_Assignment1_3.docx
+++ b/module-1/Sengvanhpheng_Assignment1_3.docx
@@ -4945,7 +4945,7 @@
         <w:rPr/>
         <w:t xml:space="preserve"> </w:t>
       </w:r>
-      <w:hyperlink r:id="Re076a7b85ff045d3">
+      <w:hyperlink r:id="R26953bdb32774836">
         <w:r>
           <w:rPr>
             <w:rStyle w:val="Hyperlink"/>
@@ -4955,19 +4955,62 @@
       </w:hyperlink>
     </w:p>
     <w:p>
+      <w:pPr>
+        <w:pStyle w:val="Normal"/>
+      </w:pPr>
+    </w:p>
+    <w:p>
       <w:r>
         <w:rPr/>
-        <w:t xml:space="preserve">Oracle. (n.d.). MySQL 8.0 </w:t>
+        <w:t xml:space="preserve">Oracle. (n.d.). </w:t>
+      </w:r>
+      <w:r>
+        <w:rPr>
+          <w:i w:val="1"/>
+          <w:iCs w:val="1"/>
+        </w:rPr>
+        <w:t xml:space="preserve">The </w:t>
+      </w:r>
+      <w:r>
+        <w:rPr>
+          <w:i w:val="1"/>
+          <w:iCs w:val="1"/>
+        </w:rPr>
+        <w:t>main features</w:t>
+      </w:r>
+      <w:r>
+        <w:rPr>
+          <w:i w:val="1"/>
+          <w:iCs w:val="1"/>
+        </w:rPr>
+        <w:t xml:space="preserve"> of </w:t>
+      </w:r>
+      <w:r>
+        <w:rPr>
+          <w:i w:val="1"/>
+          <w:iCs w:val="1"/>
+        </w:rPr>
+        <w:t xml:space="preserve">MySQL 8.0 </w:t>
+      </w:r>
+      <w:r>
+        <w:rPr>
+          <w:i w:val="1"/>
+          <w:iCs w:val="1"/>
+        </w:rPr>
+        <w:t>reference</w:t>
+      </w:r>
+      <w:r>
+        <w:rPr>
+          <w:i w:val="1"/>
+          <w:iCs w:val="1"/>
+        </w:rPr>
+        <w:t xml:space="preserve"> manual</w:t>
       </w:r>
       <w:r>
         <w:rPr/>
-        <w:t>reference</w:t>
-      </w:r>
-      <w:r>
-        <w:rPr/>
-        <w:t xml:space="preserve"> manual: Features. </w:t>
-      </w:r>
-      <w:hyperlink r:id="R02135d73b12f4d10">
+        <w:t xml:space="preserve">. </w:t>
+      </w:r>
+      <w:hyperlink r:id="R27750024c0f24699">
         <w:r>
           <w:rPr>
             <w:rStyle w:val="Hyperlink"/>

</xml_diff>